<commit_message>
complete insertion sort algorithm
</commit_message>
<xml_diff>
--- a/04_algorithm_analysis/algorithm_analysis.docx
+++ b/04_algorithm_analysis/algorithm_analysis.docx
@@ -125,7 +125,7 @@
                     </pic:cNvPicPr>
                   </pic:nvPicPr>
                   <pic:blipFill>
-                    <a:blip r:embed="rId4">
+                    <a:blip r:embed="rId5">
                       <a:extLst>
                         <a:ext uri="{28A0092B-C50C-407E-A947-70E740481C1C}">
                           <a14:useLocalDpi xmlns:a14="http://schemas.microsoft.com/office/drawing/2010/main" val="0"/>
@@ -228,21 +228,7 @@
           <w:rFonts w:asciiTheme="majorBidi" w:hAnsiTheme="majorBidi" w:cstheme="majorBidi"/>
           <w:u w:val="single"/>
         </w:rPr>
-        <w:t>Algorithm Ana</w:t>
-      </w:r>
-      <w:r>
-        <w:rPr>
-          <w:rFonts w:asciiTheme="majorBidi" w:hAnsiTheme="majorBidi" w:cstheme="majorBidi"/>
-          <w:u w:val="single"/>
-        </w:rPr>
-        <w:t>l</w:t>
-      </w:r>
-      <w:r>
-        <w:rPr>
-          <w:rFonts w:asciiTheme="majorBidi" w:hAnsiTheme="majorBidi" w:cstheme="majorBidi"/>
-          <w:u w:val="single"/>
-        </w:rPr>
-        <w:t>ysis – Calculus Function</w:t>
+        <w:t>Algorithm Analysis – Calculus Function</w:t>
       </w:r>
       <w:r>
         <w:rPr>
@@ -569,7 +555,7 @@
             <w:pPr>
               <w:jc w:val="center"/>
               <w:rPr>
-                <w:rFonts w:asciiTheme="majorBidi" w:hAnsiTheme="majorBidi" w:cstheme="majorBidi" w:hint="cs"/>
+                <w:rFonts w:asciiTheme="majorBidi" w:hAnsiTheme="majorBidi" w:cstheme="majorBidi"/>
                 <w:b/>
                 <w:bCs/>
                 <w:lang w:bidi="ar-EG"/>
@@ -596,7 +582,7 @@
             <w:pPr>
               <w:jc w:val="center"/>
               <w:rPr>
-                <w:rFonts w:asciiTheme="majorBidi" w:hAnsiTheme="majorBidi" w:cstheme="majorBidi" w:hint="cs"/>
+                <w:rFonts w:asciiTheme="majorBidi" w:hAnsiTheme="majorBidi" w:cstheme="majorBidi"/>
                 <w:b/>
                 <w:bCs/>
                 <w:rtl/>
@@ -623,7 +609,7 @@
             <w:pPr>
               <w:jc w:val="center"/>
               <w:rPr>
-                <w:rFonts w:asciiTheme="majorBidi" w:hAnsiTheme="majorBidi" w:cstheme="majorBidi" w:hint="cs"/>
+                <w:rFonts w:asciiTheme="majorBidi" w:hAnsiTheme="majorBidi" w:cstheme="majorBidi"/>
                 <w:b/>
                 <w:bCs/>
                 <w:rtl/>
@@ -704,7 +690,7 @@
             <w:pPr>
               <w:jc w:val="center"/>
               <w:rPr>
-                <w:rFonts w:asciiTheme="majorBidi" w:hAnsiTheme="majorBidi" w:cstheme="majorBidi" w:hint="cs"/>
+                <w:rFonts w:asciiTheme="majorBidi" w:hAnsiTheme="majorBidi" w:cstheme="majorBidi"/>
                 <w:b/>
                 <w:bCs/>
                 <w:lang w:bidi="ar-EG"/>
@@ -756,7 +742,7 @@
             <w:pPr>
               <w:jc w:val="center"/>
               <w:rPr>
-                <w:rFonts w:asciiTheme="majorBidi" w:hAnsiTheme="majorBidi" w:cstheme="majorBidi" w:hint="cs"/>
+                <w:rFonts w:asciiTheme="majorBidi" w:hAnsiTheme="majorBidi" w:cstheme="majorBidi"/>
                 <w:b/>
                 <w:bCs/>
                 <w:lang w:bidi="ar-EG"/>
@@ -819,7 +805,7 @@
             <w:pPr>
               <w:jc w:val="center"/>
               <w:rPr>
-                <w:rFonts w:asciiTheme="majorBidi" w:hAnsiTheme="majorBidi" w:cstheme="majorBidi" w:hint="cs"/>
+                <w:rFonts w:asciiTheme="majorBidi" w:hAnsiTheme="majorBidi" w:cstheme="majorBidi"/>
                 <w:b/>
                 <w:bCs/>
                 <w:lang w:bidi="ar-EG"/>
@@ -843,43 +829,7 @@
                 <w:bCs/>
                 <w:lang w:bidi="ar-EG"/>
               </w:rPr>
-              <w:t>4</w:t>
-            </w:r>
-            <w:r>
-              <w:rPr>
-                <w:rFonts w:asciiTheme="majorBidi" w:hAnsiTheme="majorBidi" w:cstheme="majorBidi"/>
-                <w:b/>
-                <w:bCs/>
-                <w:lang w:bidi="ar-EG"/>
-              </w:rPr>
-              <w:t xml:space="preserve">) = 2 * </w:t>
-            </w:r>
-            <w:r>
-              <w:rPr>
-                <w:rFonts w:asciiTheme="majorBidi" w:hAnsiTheme="majorBidi" w:cstheme="majorBidi"/>
-                <w:b/>
-                <w:bCs/>
-                <w:lang w:bidi="ar-EG"/>
-              </w:rPr>
-              <w:t>4</w:t>
-            </w:r>
-            <w:r>
-              <w:rPr>
-                <w:rFonts w:asciiTheme="majorBidi" w:hAnsiTheme="majorBidi" w:cstheme="majorBidi"/>
-                <w:b/>
-                <w:bCs/>
-                <w:lang w:bidi="ar-EG"/>
-              </w:rPr>
-              <w:t xml:space="preserve"> – 5 = </w:t>
-            </w:r>
-            <w:r>
-              <w:rPr>
-                <w:rFonts w:asciiTheme="majorBidi" w:hAnsiTheme="majorBidi" w:cstheme="majorBidi"/>
-                <w:b/>
-                <w:bCs/>
-                <w:lang w:bidi="ar-EG"/>
-              </w:rPr>
-              <w:t>3</w:t>
+              <w:t>4) = 2 * 4 – 5 = 3</w:t>
             </w:r>
           </w:p>
         </w:tc>
@@ -891,7 +841,7 @@
             <w:pPr>
               <w:jc w:val="center"/>
               <w:rPr>
-                <w:rFonts w:asciiTheme="majorBidi" w:hAnsiTheme="majorBidi" w:cstheme="majorBidi" w:hint="cs"/>
+                <w:rFonts w:asciiTheme="majorBidi" w:hAnsiTheme="majorBidi" w:cstheme="majorBidi"/>
                 <w:b/>
                 <w:bCs/>
                 <w:rtl/>
@@ -920,7 +870,7 @@
             <w:pPr>
               <w:jc w:val="center"/>
               <w:rPr>
-                <w:rFonts w:asciiTheme="majorBidi" w:hAnsiTheme="majorBidi" w:cstheme="majorBidi" w:hint="cs"/>
+                <w:rFonts w:asciiTheme="majorBidi" w:hAnsiTheme="majorBidi" w:cstheme="majorBidi"/>
                 <w:b/>
                 <w:bCs/>
                 <w:lang w:bidi="ar-EG"/>
@@ -944,43 +894,7 @@
                 <w:bCs/>
                 <w:lang w:bidi="ar-EG"/>
               </w:rPr>
-              <w:t>5</w:t>
-            </w:r>
-            <w:r>
-              <w:rPr>
-                <w:rFonts w:asciiTheme="majorBidi" w:hAnsiTheme="majorBidi" w:cstheme="majorBidi"/>
-                <w:b/>
-                <w:bCs/>
-                <w:lang w:bidi="ar-EG"/>
-              </w:rPr>
-              <w:t xml:space="preserve">) = 2 * </w:t>
-            </w:r>
-            <w:r>
-              <w:rPr>
-                <w:rFonts w:asciiTheme="majorBidi" w:hAnsiTheme="majorBidi" w:cstheme="majorBidi"/>
-                <w:b/>
-                <w:bCs/>
-                <w:lang w:bidi="ar-EG"/>
-              </w:rPr>
-              <w:t>5</w:t>
-            </w:r>
-            <w:r>
-              <w:rPr>
-                <w:rFonts w:asciiTheme="majorBidi" w:hAnsiTheme="majorBidi" w:cstheme="majorBidi"/>
-                <w:b/>
-                <w:bCs/>
-                <w:lang w:bidi="ar-EG"/>
-              </w:rPr>
-              <w:t xml:space="preserve"> – 5 = </w:t>
-            </w:r>
-            <w:r>
-              <w:rPr>
-                <w:rFonts w:asciiTheme="majorBidi" w:hAnsiTheme="majorBidi" w:cstheme="majorBidi"/>
-                <w:b/>
-                <w:bCs/>
-                <w:lang w:bidi="ar-EG"/>
-              </w:rPr>
-              <w:t>5</w:t>
+              <w:t>5) = 2 * 5 – 5 = 5</w:t>
             </w:r>
           </w:p>
         </w:tc>
@@ -1067,7 +981,7 @@
       <w:pPr>
         <w:spacing w:after="0"/>
         <w:rPr>
-          <w:rFonts w:asciiTheme="majorBidi" w:hAnsiTheme="majorBidi" w:cstheme="majorBidi" w:hint="cs"/>
+          <w:rFonts w:asciiTheme="majorBidi" w:hAnsiTheme="majorBidi" w:cstheme="majorBidi"/>
           <w:rtl/>
           <w:lang w:bidi="ar-EG"/>
         </w:rPr>
@@ -1093,42 +1007,7 @@
           <w:rFonts w:asciiTheme="majorBidi" w:hAnsiTheme="majorBidi" w:cstheme="majorBidi"/>
           <w:lang w:bidi="ar-EG"/>
         </w:rPr>
-        <w:t xml:space="preserve">Lowest </w:t>
-      </w:r>
-      <w:r>
-        <w:rPr>
-          <w:rFonts w:asciiTheme="majorBidi" w:hAnsiTheme="majorBidi" w:cstheme="majorBidi"/>
-          <w:lang w:bidi="ar-EG"/>
-        </w:rPr>
-        <w:t>bound</w:t>
-      </w:r>
-      <w:r>
-        <w:rPr>
-          <w:rFonts w:asciiTheme="majorBidi" w:hAnsiTheme="majorBidi" w:cstheme="majorBidi"/>
-          <w:lang w:bidi="ar-EG"/>
-        </w:rPr>
-        <w:t xml:space="preserve"> &lt;= x &lt;= </w:t>
-      </w:r>
-      <w:r>
-        <w:rPr>
-          <w:rFonts w:asciiTheme="majorBidi" w:hAnsiTheme="majorBidi" w:cstheme="majorBidi"/>
-          <w:lang w:bidi="ar-EG"/>
-        </w:rPr>
-        <w:t>upper</w:t>
-      </w:r>
-      <w:r>
-        <w:rPr>
-          <w:rFonts w:asciiTheme="majorBidi" w:hAnsiTheme="majorBidi" w:cstheme="majorBidi"/>
-          <w:lang w:bidi="ar-EG"/>
-        </w:rPr>
-        <w:t xml:space="preserve"> </w:t>
-      </w:r>
-      <w:r>
-        <w:rPr>
-          <w:rFonts w:asciiTheme="majorBidi" w:hAnsiTheme="majorBidi" w:cstheme="majorBidi"/>
-          <w:lang w:bidi="ar-EG"/>
-        </w:rPr>
-        <w:t>bound</w:t>
+        <w:t>Lowest bound &lt;= x &lt;= upper bound</w:t>
       </w:r>
     </w:p>
     <w:p>
@@ -1155,7 +1034,7 @@
       <w:pPr>
         <w:spacing w:after="0"/>
         <w:rPr>
-          <w:rFonts w:asciiTheme="majorBidi" w:hAnsiTheme="majorBidi" w:cstheme="majorBidi" w:hint="cs"/>
+          <w:rFonts w:asciiTheme="majorBidi" w:hAnsiTheme="majorBidi" w:cstheme="majorBidi"/>
           <w:b/>
           <w:bCs/>
           <w:rtl/>
@@ -1169,25 +1048,7 @@
           <w:bCs/>
           <w:lang w:bidi="ar-EG"/>
         </w:rPr>
-        <w:t>D = [0; +</w:t>
-      </w:r>
-      <w:r>
-        <w:rPr>
-          <w:rFonts w:asciiTheme="majorBidi" w:hAnsiTheme="majorBidi" w:cstheme="majorBidi"/>
-          <w:b/>
-          <w:bCs/>
-          <w:lang w:bidi="ar-EG"/>
-        </w:rPr>
-        <w:t>∞</w:t>
-      </w:r>
-      <w:r>
-        <w:rPr>
-          <w:rFonts w:asciiTheme="majorBidi" w:hAnsiTheme="majorBidi" w:cstheme="majorBidi"/>
-          <w:b/>
-          <w:bCs/>
-          <w:lang w:bidi="ar-EG"/>
-        </w:rPr>
-        <w:t xml:space="preserve"> [</w:t>
+        <w:t>D = [0; +∞ [</w:t>
       </w:r>
     </w:p>
     <w:p>
@@ -1265,7 +1126,7 @@
       <w:pPr>
         <w:spacing w:after="0"/>
         <w:rPr>
-          <w:rFonts w:asciiTheme="majorBidi" w:hAnsiTheme="majorBidi" w:cstheme="majorBidi" w:hint="cs"/>
+          <w:rFonts w:asciiTheme="majorBidi" w:hAnsiTheme="majorBidi" w:cstheme="majorBidi"/>
           <w:rtl/>
           <w:lang w:bidi="ar-EG"/>
         </w:rPr>
@@ -1370,7 +1231,7 @@
         </w:pBdr>
         <w:spacing w:after="0"/>
         <w:rPr>
-          <w:rFonts w:asciiTheme="majorBidi" w:hAnsiTheme="majorBidi" w:cstheme="majorBidi" w:hint="cs"/>
+          <w:rFonts w:asciiTheme="majorBidi" w:hAnsiTheme="majorBidi" w:cstheme="majorBidi"/>
           <w:rtl/>
           <w:lang w:bidi="ar-EG"/>
         </w:rPr>
@@ -1461,14 +1322,7 @@
                 <w:rFonts w:ascii="Cambria Math" w:hAnsi="Cambria Math" w:cstheme="majorBidi"/>
                 <w:lang w:bidi="ar-EG"/>
               </w:rPr>
-              <m:t>x</m:t>
-            </m:r>
-            <m:r>
-              <w:rPr>
-                <w:rFonts w:ascii="Cambria Math" w:hAnsi="Cambria Math" w:cstheme="majorBidi"/>
-                <w:lang w:bidi="ar-EG"/>
-              </w:rPr>
-              <m:t>-16</m:t>
+              <m:t>x-16</m:t>
             </m:r>
           </m:e>
         </m:rad>
@@ -1498,16 +1352,7 @@
           <w:bCs/>
           <w:lang w:bidi="ar-EG"/>
         </w:rPr>
-        <w:t xml:space="preserve">16 &lt;= x &lt;= </w:t>
-      </w:r>
-      <w:r>
-        <w:rPr>
-          <w:rFonts w:asciiTheme="majorBidi" w:hAnsiTheme="majorBidi" w:cstheme="majorBidi"/>
-          <w:b/>
-          <w:bCs/>
-          <w:lang w:bidi="ar-EG"/>
-        </w:rPr>
-        <w:t>∞</w:t>
+        <w:t>16 &lt;= x &lt;= ∞</w:t>
       </w:r>
     </w:p>
     <w:p>
@@ -1832,28 +1677,7 @@
           <w:rFonts w:asciiTheme="majorBidi" w:hAnsiTheme="majorBidi" w:cstheme="majorBidi"/>
           <w:lang w:bidi="ar-EG"/>
         </w:rPr>
-        <w:t>x = 1.9</w:t>
-      </w:r>
-      <w:r>
-        <w:rPr>
-          <w:rFonts w:asciiTheme="majorBidi" w:hAnsiTheme="majorBidi" w:cstheme="majorBidi"/>
-          <w:lang w:bidi="ar-EG"/>
-        </w:rPr>
-        <w:t>9</w:t>
-      </w:r>
-      <w:r>
-        <w:rPr>
-          <w:rFonts w:asciiTheme="majorBidi" w:hAnsiTheme="majorBidi" w:cstheme="majorBidi"/>
-          <w:lang w:bidi="ar-EG"/>
-        </w:rPr>
-        <w:t xml:space="preserve"> then f(x) = </w:t>
-      </w:r>
-      <w:r>
-        <w:rPr>
-          <w:rFonts w:asciiTheme="majorBidi" w:hAnsiTheme="majorBidi" w:cstheme="majorBidi"/>
-          <w:lang w:bidi="ar-EG"/>
-        </w:rPr>
-        <w:t>10.88</w:t>
+        <w:t>x = 1.99 then f(x) = 10.88</w:t>
       </w:r>
     </w:p>
     <w:p>
@@ -1869,28 +1693,7 @@
           <w:rFonts w:asciiTheme="majorBidi" w:hAnsiTheme="majorBidi" w:cstheme="majorBidi"/>
           <w:lang w:bidi="ar-EG"/>
         </w:rPr>
-        <w:t>x = 1.9</w:t>
-      </w:r>
-      <w:r>
-        <w:rPr>
-          <w:rFonts w:asciiTheme="majorBidi" w:hAnsiTheme="majorBidi" w:cstheme="majorBidi"/>
-          <w:lang w:bidi="ar-EG"/>
-        </w:rPr>
-        <w:t>99</w:t>
-      </w:r>
-      <w:r>
-        <w:rPr>
-          <w:rFonts w:asciiTheme="majorBidi" w:hAnsiTheme="majorBidi" w:cstheme="majorBidi"/>
-          <w:lang w:bidi="ar-EG"/>
-        </w:rPr>
-        <w:t xml:space="preserve"> then f(x) = </w:t>
-      </w:r>
-      <w:r>
-        <w:rPr>
-          <w:rFonts w:asciiTheme="majorBidi" w:hAnsiTheme="majorBidi" w:cstheme="majorBidi"/>
-          <w:lang w:bidi="ar-EG"/>
-        </w:rPr>
-        <w:t>10.988</w:t>
+        <w:t>x = 1.999 then f(x) = 10.988</w:t>
       </w:r>
     </w:p>
     <w:p>
@@ -1906,21 +1709,7 @@
           <w:rFonts w:asciiTheme="majorBidi" w:hAnsiTheme="majorBidi" w:cstheme="majorBidi"/>
           <w:lang w:bidi="ar-EG"/>
         </w:rPr>
-        <w:t>x = 1.9</w:t>
-      </w:r>
-      <w:r>
-        <w:rPr>
-          <w:rFonts w:asciiTheme="majorBidi" w:hAnsiTheme="majorBidi" w:cstheme="majorBidi"/>
-          <w:lang w:bidi="ar-EG"/>
-        </w:rPr>
-        <w:t>999</w:t>
-      </w:r>
-      <w:r>
-        <w:rPr>
-          <w:rFonts w:asciiTheme="majorBidi" w:hAnsiTheme="majorBidi" w:cstheme="majorBidi"/>
-          <w:lang w:bidi="ar-EG"/>
-        </w:rPr>
-        <w:t xml:space="preserve"> then f(x) = </w:t>
+        <w:t xml:space="preserve">x = 1.9999 then f(x) = </w:t>
       </w:r>
       <w:r>
         <w:rPr>
@@ -2029,14 +1818,7 @@
                   <w:rFonts w:ascii="Cambria Math" w:hAnsi="Cambria Math" w:cstheme="majorBidi"/>
                   <w:lang w:bidi="ar-EG"/>
                 </w:rPr>
-                <m:t xml:space="preserve">-1= </m:t>
-              </m:r>
-              <m:r>
-                <w:rPr>
-                  <w:rFonts w:ascii="Cambria Math" w:hAnsi="Cambria Math" w:cstheme="majorBidi"/>
-                  <w:lang w:bidi="ar-EG"/>
-                </w:rPr>
-                <m:t>11</m:t>
+                <m:t>-1= 11</m:t>
               </m:r>
             </m:e>
           </m:func>
@@ -2074,6 +1856,16 @@
           <w:bCs/>
           <w:lang w:bidi="ar-EG"/>
         </w:rPr>
+        <w:t>2) = 3x</w:t>
+      </w:r>
+      <w:r>
+        <w:rPr>
+          <w:rFonts w:asciiTheme="majorBidi" w:hAnsiTheme="majorBidi" w:cstheme="majorBidi"/>
+          <w:b/>
+          <w:bCs/>
+          <w:vertAlign w:val="superscript"/>
+          <w:lang w:bidi="ar-EG"/>
+        </w:rPr>
         <w:t>2</w:t>
       </w:r>
       <w:r>
@@ -2083,35 +1875,7 @@
           <w:bCs/>
           <w:lang w:bidi="ar-EG"/>
         </w:rPr>
-        <w:t>) = 3x</w:t>
-      </w:r>
-      <w:r>
-        <w:rPr>
-          <w:rFonts w:asciiTheme="majorBidi" w:hAnsiTheme="majorBidi" w:cstheme="majorBidi"/>
-          <w:b/>
-          <w:bCs/>
-          <w:vertAlign w:val="superscript"/>
-          <w:lang w:bidi="ar-EG"/>
-        </w:rPr>
-        <w:t>2</w:t>
-      </w:r>
-      <w:r>
-        <w:rPr>
-          <w:rFonts w:asciiTheme="majorBidi" w:hAnsiTheme="majorBidi" w:cstheme="majorBidi"/>
-          <w:b/>
-          <w:bCs/>
-          <w:lang w:bidi="ar-EG"/>
-        </w:rPr>
-        <w:t xml:space="preserve"> -1</w:t>
-      </w:r>
-      <w:r>
-        <w:rPr>
-          <w:rFonts w:asciiTheme="majorBidi" w:hAnsiTheme="majorBidi" w:cstheme="majorBidi"/>
-          <w:b/>
-          <w:bCs/>
-          <w:lang w:bidi="ar-EG"/>
-        </w:rPr>
-        <w:t xml:space="preserve"> = 11</w:t>
+        <w:t xml:space="preserve"> -1 = 11</w:t>
       </w:r>
     </w:p>
     <w:tbl>
@@ -2542,17 +2306,7 @@
                       <w:rFonts w:ascii="Cambria Math" w:hAnsi="Cambria Math" w:cstheme="majorBidi"/>
                       <w:lang w:bidi="ar-EG"/>
                     </w:rPr>
-                    <m:t>2</m:t>
-                  </m:r>
-                  <m:r>
-                    <m:rPr>
-                      <m:sty m:val="bi"/>
-                    </m:rPr>
-                    <w:rPr>
-                      <w:rFonts w:ascii="Cambria Math" w:hAnsi="Cambria Math" w:cstheme="majorBidi"/>
-                      <w:lang w:bidi="ar-EG"/>
-                    </w:rPr>
-                    <m:t>-2</m:t>
+                    <m:t>2-2</m:t>
                   </m:r>
                 </m:den>
               </m:f>
@@ -2640,34 +2394,7 @@
                 <w:bCs/>
                 <w:lang w:bidi="ar-EG"/>
               </w:rPr>
-              <w:t>X = 1.9</w:t>
-            </w:r>
-            <w:r>
-              <w:rPr>
-                <w:rFonts w:ascii="Times New Roman" w:eastAsia="Calibri" w:hAnsi="Times New Roman" w:cs="Times New Roman"/>
-                <w:b/>
-                <w:bCs/>
-                <w:lang w:bidi="ar-EG"/>
-              </w:rPr>
-              <w:t>9</w:t>
-            </w:r>
-            <w:r>
-              <w:rPr>
-                <w:rFonts w:ascii="Times New Roman" w:eastAsia="Calibri" w:hAnsi="Times New Roman" w:cs="Times New Roman"/>
-                <w:b/>
-                <w:bCs/>
-                <w:lang w:bidi="ar-EG"/>
-              </w:rPr>
-              <w:t xml:space="preserve"> then f(x) = 3.9</w:t>
-            </w:r>
-            <w:r>
-              <w:rPr>
-                <w:rFonts w:ascii="Times New Roman" w:eastAsia="Calibri" w:hAnsi="Times New Roman" w:cs="Times New Roman"/>
-                <w:b/>
-                <w:bCs/>
-                <w:lang w:bidi="ar-EG"/>
-              </w:rPr>
-              <w:t>9</w:t>
+              <w:t>X = 1.99 then f(x) = 3.99</w:t>
             </w:r>
           </w:p>
         </w:tc>
@@ -2707,34 +2434,7 @@
                 <w:bCs/>
                 <w:lang w:bidi="ar-EG"/>
               </w:rPr>
-              <w:t>X = 1.</w:t>
-            </w:r>
-            <w:r>
-              <w:rPr>
-                <w:rFonts w:ascii="Times New Roman" w:eastAsia="Calibri" w:hAnsi="Times New Roman" w:cs="Times New Roman"/>
-                <w:b/>
-                <w:bCs/>
-                <w:lang w:bidi="ar-EG"/>
-              </w:rPr>
-              <w:t>99</w:t>
-            </w:r>
-            <w:r>
-              <w:rPr>
-                <w:rFonts w:ascii="Times New Roman" w:eastAsia="Calibri" w:hAnsi="Times New Roman" w:cs="Times New Roman"/>
-                <w:b/>
-                <w:bCs/>
-                <w:lang w:bidi="ar-EG"/>
-              </w:rPr>
-              <w:t>9 then f(x) = 3.9</w:t>
-            </w:r>
-            <w:r>
-              <w:rPr>
-                <w:rFonts w:ascii="Times New Roman" w:eastAsia="Calibri" w:hAnsi="Times New Roman" w:cs="Times New Roman"/>
-                <w:b/>
-                <w:bCs/>
-                <w:lang w:bidi="ar-EG"/>
-              </w:rPr>
-              <w:t>99</w:t>
+              <w:t>X = 1.999 then f(x) = 3.999</w:t>
             </w:r>
           </w:p>
         </w:tc>
@@ -3361,16 +3061,7 @@
           <w:bCs/>
           <w:lang w:bidi="ar-EG"/>
         </w:rPr>
-        <w:t xml:space="preserve"> </w:t>
-      </w:r>
-      <w:r>
-        <w:rPr>
-          <w:rFonts w:asciiTheme="majorBidi" w:hAnsiTheme="majorBidi" w:cstheme="majorBidi"/>
-          <w:b/>
-          <w:bCs/>
-          <w:lang w:bidi="ar-EG"/>
-        </w:rPr>
-        <w:t>∞</w:t>
+        <w:t xml:space="preserve"> ∞</w:t>
       </w:r>
     </w:p>
     <w:p>
@@ -3547,36 +3238,388 @@
           <w:szCs w:val="28"/>
           <w:lang w:bidi="ar-EG"/>
         </w:rPr>
-        <w:t>O(</w:t>
-      </w:r>
-      <w:r>
+        <w:t>O(n)2</w:t>
+      </w:r>
+    </w:p>
+    <w:p>
+      <w:pPr>
+        <w:bidi/>
+        <w:spacing w:after="0"/>
         <w:rPr>
           <w:rFonts w:asciiTheme="majorBidi" w:hAnsiTheme="majorBidi" w:cstheme="majorBidi"/>
           <w:b/>
           <w:bCs/>
           <w:sz w:val="28"/>
           <w:szCs w:val="28"/>
-          <w:lang w:bidi="ar-EG"/>
-        </w:rPr>
-        <w:t>n</w:t>
-      </w:r>
-      <w:r>
-        <w:rPr>
-          <w:rFonts w:asciiTheme="majorBidi" w:hAnsiTheme="majorBidi" w:cstheme="majorBidi"/>
+          <w:rtl/>
+          <w:lang w:bidi="ar-EG"/>
+        </w:rPr>
+      </w:pPr>
+      <w:r>
+        <w:rPr>
+          <w:rFonts w:asciiTheme="majorBidi" w:hAnsiTheme="majorBidi" w:cstheme="majorBidi" w:hint="cs"/>
           <w:b/>
           <w:bCs/>
           <w:sz w:val="28"/>
           <w:szCs w:val="28"/>
-          <w:lang w:bidi="ar-EG"/>
-        </w:rPr>
-        <w:t>)2</w:t>
+          <w:rtl/>
+          <w:lang w:bidi="ar-EG"/>
+        </w:rPr>
+        <w:t>- مثال</w:t>
+      </w:r>
+    </w:p>
+    <w:p>
+      <w:pPr>
+        <w:spacing w:after="0"/>
+        <w:jc w:val="center"/>
+        <w:rPr>
+          <w:rFonts w:asciiTheme="majorBidi" w:hAnsiTheme="majorBidi" w:cstheme="majorBidi"/>
+          <w:b/>
+          <w:bCs/>
+          <w:sz w:val="28"/>
+          <w:szCs w:val="28"/>
+          <w:lang w:bidi="ar-EG"/>
+        </w:rPr>
+      </w:pPr>
+      <w:r>
+        <w:rPr>
+          <w:rFonts w:asciiTheme="majorBidi" w:hAnsiTheme="majorBidi" w:cstheme="majorBidi"/>
+          <w:b/>
+          <w:bCs/>
+          <w:sz w:val="28"/>
+          <w:szCs w:val="28"/>
+          <w:lang w:bidi="ar-EG"/>
+        </w:rPr>
+        <w:t>Sum of numbers from 1 to n</w:t>
       </w:r>
     </w:p>
     <w:p>
       <w:pPr>
         <w:bidi/>
         <w:spacing w:after="0"/>
-        <w:jc w:val="center"/>
+        <w:rPr>
+          <w:rFonts w:asciiTheme="majorBidi" w:hAnsiTheme="majorBidi" w:cstheme="majorBidi"/>
+          <w:b/>
+          <w:bCs/>
+          <w:sz w:val="28"/>
+          <w:szCs w:val="28"/>
+          <w:lang w:bidi="ar-EG"/>
+        </w:rPr>
+      </w:pPr>
+      <w:r>
+        <w:rPr>
+          <w:rFonts w:asciiTheme="majorBidi" w:hAnsiTheme="majorBidi" w:cstheme="majorBidi" w:hint="cs"/>
+          <w:b/>
+          <w:bCs/>
+          <w:sz w:val="28"/>
+          <w:szCs w:val="28"/>
+          <w:rtl/>
+          <w:lang w:bidi="ar-EG"/>
+        </w:rPr>
+        <w:t xml:space="preserve">- مثال لو هديله </w:t>
+      </w:r>
+      <w:r>
+        <w:rPr>
+          <w:rFonts w:asciiTheme="majorBidi" w:hAnsiTheme="majorBidi" w:cstheme="majorBidi"/>
+          <w:b/>
+          <w:bCs/>
+          <w:sz w:val="28"/>
+          <w:szCs w:val="28"/>
+          <w:lang w:bidi="ar-EG"/>
+        </w:rPr>
+        <w:t>n=5</w:t>
+      </w:r>
+    </w:p>
+    <w:p>
+      <w:pPr>
+        <w:bidi/>
+        <w:spacing w:after="0"/>
+        <w:rPr>
+          <w:rFonts w:asciiTheme="majorBidi" w:hAnsiTheme="majorBidi" w:cstheme="majorBidi"/>
+          <w:b/>
+          <w:bCs/>
+          <w:sz w:val="28"/>
+          <w:szCs w:val="28"/>
+          <w:lang w:bidi="ar-EG"/>
+        </w:rPr>
+      </w:pPr>
+      <w:r>
+        <w:rPr>
+          <w:rFonts w:asciiTheme="majorBidi" w:hAnsiTheme="majorBidi" w:cstheme="majorBidi"/>
+          <w:b/>
+          <w:bCs/>
+          <w:sz w:val="28"/>
+          <w:szCs w:val="28"/>
+          <w:lang w:bidi="ar-EG"/>
+        </w:rPr>
+        <w:t>1+2+3+4+5</w:t>
+      </w:r>
+    </w:p>
+    <w:tbl>
+      <w:tblPr>
+        <w:tblStyle w:val="TableGrid"/>
+        <w:bidiVisual/>
+        <w:tblW w:w="0" w:type="auto"/>
+        <w:tblInd w:w="5432" w:type="dxa"/>
+        <w:tblLook w:val="04A0" w:firstRow="1" w:lastRow="0" w:firstColumn="1" w:lastColumn="0" w:noHBand="0" w:noVBand="1"/>
+      </w:tblPr>
+      <w:tblGrid>
+        <w:gridCol w:w="5096"/>
+      </w:tblGrid>
+      <w:tr>
+        <w:tc>
+          <w:tcPr>
+            <w:tcW w:w="5096" w:type="dxa"/>
+          </w:tcPr>
+          <w:p>
+            <w:pPr>
+              <w:rPr>
+                <w:rFonts w:asciiTheme="majorBidi" w:hAnsiTheme="majorBidi" w:cstheme="majorBidi"/>
+                <w:b/>
+                <w:bCs/>
+                <w:sz w:val="28"/>
+                <w:szCs w:val="28"/>
+                <w:lang w:bidi="ar-EG"/>
+              </w:rPr>
+            </w:pPr>
+            <w:r>
+              <w:rPr>
+                <w:rFonts w:asciiTheme="majorBidi" w:hAnsiTheme="majorBidi" w:cstheme="majorBidi"/>
+                <w:b/>
+                <w:bCs/>
+                <w:sz w:val="28"/>
+                <w:szCs w:val="28"/>
+                <w:lang w:bidi="ar-EG"/>
+              </w:rPr>
+              <w:t>function</w:t>
+            </w:r>
+            <w:r>
+              <w:rPr>
+                <w:rFonts w:asciiTheme="majorBidi" w:hAnsiTheme="majorBidi" w:cstheme="majorBidi"/>
+                <w:b/>
+                <w:bCs/>
+                <w:sz w:val="28"/>
+                <w:szCs w:val="28"/>
+                <w:lang w:bidi="ar-EG"/>
+              </w:rPr>
+              <w:t xml:space="preserve"> sum(n) {</w:t>
+            </w:r>
+            <w:r>
+              <w:rPr>
+                <w:rFonts w:asciiTheme="majorBidi" w:hAnsiTheme="majorBidi" w:cstheme="majorBidi"/>
+                <w:b/>
+                <w:bCs/>
+                <w:sz w:val="28"/>
+                <w:szCs w:val="28"/>
+                <w:lang w:bidi="ar-EG"/>
+              </w:rPr>
+              <w:br/>
+              <w:t>var sum = 0;</w:t>
+            </w:r>
+          </w:p>
+          <w:p>
+            <w:pPr>
+              <w:rPr>
+                <w:rFonts w:asciiTheme="majorBidi" w:hAnsiTheme="majorBidi" w:cstheme="majorBidi"/>
+                <w:b/>
+                <w:bCs/>
+                <w:sz w:val="28"/>
+                <w:szCs w:val="28"/>
+                <w:lang w:bidi="ar-EG"/>
+              </w:rPr>
+            </w:pPr>
+            <w:r>
+              <w:rPr>
+                <w:rFonts w:asciiTheme="majorBidi" w:hAnsiTheme="majorBidi" w:cstheme="majorBidi"/>
+                <w:b/>
+                <w:bCs/>
+                <w:sz w:val="28"/>
+                <w:szCs w:val="28"/>
+                <w:lang w:bidi="ar-EG"/>
+              </w:rPr>
+              <w:t xml:space="preserve">for (var </w:t>
+            </w:r>
+            <w:proofErr w:type="spellStart"/>
+            <w:r>
+              <w:rPr>
+                <w:rFonts w:asciiTheme="majorBidi" w:hAnsiTheme="majorBidi" w:cstheme="majorBidi"/>
+                <w:b/>
+                <w:bCs/>
+                <w:sz w:val="28"/>
+                <w:szCs w:val="28"/>
+                <w:lang w:bidi="ar-EG"/>
+              </w:rPr>
+              <w:t>i</w:t>
+            </w:r>
+            <w:proofErr w:type="spellEnd"/>
+            <w:r>
+              <w:rPr>
+                <w:rFonts w:asciiTheme="majorBidi" w:hAnsiTheme="majorBidi" w:cstheme="majorBidi"/>
+                <w:b/>
+                <w:bCs/>
+                <w:sz w:val="28"/>
+                <w:szCs w:val="28"/>
+                <w:lang w:bidi="ar-EG"/>
+              </w:rPr>
+              <w:t xml:space="preserve"> = </w:t>
+            </w:r>
+            <w:proofErr w:type="gramStart"/>
+            <w:r>
+              <w:rPr>
+                <w:rFonts w:asciiTheme="majorBidi" w:hAnsiTheme="majorBidi" w:cstheme="majorBidi"/>
+                <w:b/>
+                <w:bCs/>
+                <w:sz w:val="28"/>
+                <w:szCs w:val="28"/>
+                <w:lang w:bidi="ar-EG"/>
+              </w:rPr>
+              <w:t>1;i</w:t>
+            </w:r>
+            <w:proofErr w:type="gramEnd"/>
+            <w:r>
+              <w:rPr>
+                <w:rFonts w:asciiTheme="majorBidi" w:hAnsiTheme="majorBidi" w:cstheme="majorBidi"/>
+                <w:b/>
+                <w:bCs/>
+                <w:sz w:val="28"/>
+                <w:szCs w:val="28"/>
+                <w:lang w:bidi="ar-EG"/>
+              </w:rPr>
+              <w:t xml:space="preserve"> &lt;= n; </w:t>
+            </w:r>
+            <w:proofErr w:type="spellStart"/>
+            <w:r>
+              <w:rPr>
+                <w:rFonts w:asciiTheme="majorBidi" w:hAnsiTheme="majorBidi" w:cstheme="majorBidi"/>
+                <w:b/>
+                <w:bCs/>
+                <w:sz w:val="28"/>
+                <w:szCs w:val="28"/>
+                <w:lang w:bidi="ar-EG"/>
+              </w:rPr>
+              <w:t>i</w:t>
+            </w:r>
+            <w:proofErr w:type="spellEnd"/>
+            <w:r>
+              <w:rPr>
+                <w:rFonts w:asciiTheme="majorBidi" w:hAnsiTheme="majorBidi" w:cstheme="majorBidi"/>
+                <w:b/>
+                <w:bCs/>
+                <w:sz w:val="28"/>
+                <w:szCs w:val="28"/>
+                <w:lang w:bidi="ar-EG"/>
+              </w:rPr>
+              <w:t>++) {</w:t>
+            </w:r>
+          </w:p>
+          <w:p>
+            <w:pPr>
+              <w:rPr>
+                <w:rFonts w:asciiTheme="majorBidi" w:hAnsiTheme="majorBidi" w:cstheme="majorBidi"/>
+                <w:b/>
+                <w:bCs/>
+                <w:sz w:val="28"/>
+                <w:szCs w:val="28"/>
+                <w:rtl/>
+                <w:lang w:bidi="ar-EG"/>
+              </w:rPr>
+            </w:pPr>
+            <w:r>
+              <w:rPr>
+                <w:rFonts w:asciiTheme="majorBidi" w:hAnsiTheme="majorBidi" w:cstheme="majorBidi"/>
+                <w:b/>
+                <w:bCs/>
+                <w:sz w:val="28"/>
+                <w:szCs w:val="28"/>
+                <w:lang w:bidi="ar-EG"/>
+              </w:rPr>
+              <w:t xml:space="preserve">sum += </w:t>
+            </w:r>
+            <w:proofErr w:type="spellStart"/>
+            <w:r>
+              <w:rPr>
+                <w:rFonts w:asciiTheme="majorBidi" w:hAnsiTheme="majorBidi" w:cstheme="majorBidi"/>
+                <w:b/>
+                <w:bCs/>
+                <w:sz w:val="28"/>
+                <w:szCs w:val="28"/>
+                <w:lang w:bidi="ar-EG"/>
+              </w:rPr>
+              <w:t>i</w:t>
+            </w:r>
+            <w:proofErr w:type="spellEnd"/>
+            <w:r>
+              <w:rPr>
+                <w:rFonts w:asciiTheme="majorBidi" w:hAnsiTheme="majorBidi" w:cstheme="majorBidi"/>
+                <w:b/>
+                <w:bCs/>
+                <w:sz w:val="28"/>
+                <w:szCs w:val="28"/>
+                <w:lang w:bidi="ar-EG"/>
+              </w:rPr>
+              <w:t>;</w:t>
+            </w:r>
+            <w:r>
+              <w:rPr>
+                <w:rFonts w:asciiTheme="majorBidi" w:hAnsiTheme="majorBidi" w:cstheme="majorBidi"/>
+                <w:b/>
+                <w:bCs/>
+                <w:sz w:val="28"/>
+                <w:szCs w:val="28"/>
+                <w:lang w:bidi="ar-EG"/>
+              </w:rPr>
+              <w:br/>
+              <w:t xml:space="preserve"> }</w:t>
+            </w:r>
+            <w:r>
+              <w:rPr>
+                <w:rFonts w:asciiTheme="majorBidi" w:hAnsiTheme="majorBidi" w:cstheme="majorBidi"/>
+                <w:b/>
+                <w:bCs/>
+                <w:sz w:val="28"/>
+                <w:szCs w:val="28"/>
+                <w:lang w:bidi="ar-EG"/>
+              </w:rPr>
+              <w:br/>
+              <w:t>return sum</w:t>
+            </w:r>
+            <w:r>
+              <w:rPr>
+                <w:rFonts w:asciiTheme="majorBidi" w:hAnsiTheme="majorBidi" w:cstheme="majorBidi"/>
+                <w:b/>
+                <w:bCs/>
+                <w:sz w:val="28"/>
+                <w:szCs w:val="28"/>
+                <w:lang w:bidi="ar-EG"/>
+              </w:rPr>
+              <w:br/>
+              <w:t>}</w:t>
+            </w:r>
+          </w:p>
+        </w:tc>
+      </w:tr>
+    </w:tbl>
+    <w:p>
+      <w:pPr>
+        <w:pBdr>
+          <w:bottom w:val="single" w:sz="6" w:space="1" w:color="auto"/>
+        </w:pBdr>
+        <w:bidi/>
+        <w:spacing w:after="0"/>
+        <w:rPr>
+          <w:rFonts w:asciiTheme="majorBidi" w:hAnsiTheme="majorBidi" w:cstheme="majorBidi"/>
+          <w:b/>
+          <w:bCs/>
+          <w:sz w:val="28"/>
+          <w:szCs w:val="28"/>
+          <w:lang w:bidi="ar-EG"/>
+        </w:rPr>
+      </w:pPr>
+    </w:p>
+    <w:p>
+      <w:pPr>
+        <w:bidi/>
+        <w:spacing w:after="0"/>
         <w:rPr>
           <w:rFonts w:asciiTheme="majorBidi" w:hAnsiTheme="majorBidi" w:cstheme="majorBidi"/>
           <w:b/>
@@ -4846,4 +4889,16 @@
     </a:ext>
   </a:extLst>
 </a:theme>
+</file>
+
+<file path=customXml/item1.xml><?xml version="1.0" encoding="utf-8"?>
+<b:Sources xmlns:b="http://schemas.openxmlformats.org/officeDocument/2006/bibliography" xmlns="http://schemas.openxmlformats.org/officeDocument/2006/bibliography" SelectedStyle="\APASixthEditionOfficeOnline.xsl" StyleName="APA" Version="6"/>
+</file>
+
+<file path=customXml/itemProps1.xml><?xml version="1.0" encoding="utf-8"?>
+<ds:datastoreItem xmlns:ds="http://schemas.openxmlformats.org/officeDocument/2006/customXml" ds:itemID="{F2D9D703-6BC9-4191-989D-B90819F53DB3}">
+  <ds:schemaRefs>
+    <ds:schemaRef ds:uri="http://schemas.openxmlformats.org/officeDocument/2006/bibliography"/>
+  </ds:schemaRefs>
+</ds:datastoreItem>
 </file>
</xml_diff>